<commit_message>
added cliente_telefone_numero_x/ cliente_telefone_tipo_x descriptions
</commit_message>
<xml_diff>
--- a/Planilhas_importação/Descrição_campos_planilhas/Documentação - Colunas da planilha para importação dos clientes.docx
+++ b/Planilhas_importação/Descrição_campos_planilhas/Documentação - Colunas da planilha para importação dos clientes.docx
@@ -6,7 +6,7 @@
       <w:tblPr>
         <w:tblW w:w="9574" w:type="dxa"/>
         <w:jc w:val="start"/>
-        <w:tblInd w:w="52" w:type="dxa"/>
+        <w:tblInd w:w="112" w:type="dxa"/>
         <w:tblLayout w:type="fixed"/>
         <w:tblCellMar>
           <w:top w:w="55" w:type="dxa"/>
@@ -1055,42 +1055,7 @@
                 <w:sz w:val="20"/>
                 <w:szCs w:val="20"/>
               </w:rPr>
-              <w:t>Opcional. Informe o órgão emissor do documento de identificação cliente.</w:t>
-            </w:r>
-          </w:p>
-          <w:p>
-            <w:pPr>
-              <w:pStyle w:val="Normal"/>
-              <w:bidi w:val="0"/>
-              <w:jc w:val="start"/>
-              <w:rPr>
-                <w:sz w:val="20"/>
-                <w:szCs w:val="20"/>
-              </w:rPr>
-            </w:pPr>
-            <w:r>
-              <w:rPr>
-                <w:sz w:val="20"/>
-                <w:szCs w:val="20"/>
-              </w:rPr>
-            </w:r>
-          </w:p>
-          <w:p>
-            <w:pPr>
-              <w:pStyle w:val="Normal"/>
-              <w:bidi w:val="0"/>
-              <w:jc w:val="start"/>
-              <w:rPr>
-                <w:sz w:val="20"/>
-                <w:szCs w:val="20"/>
-              </w:rPr>
-            </w:pPr>
-            <w:r>
-              <w:rPr>
-                <w:sz w:val="20"/>
-                <w:szCs w:val="20"/>
-              </w:rPr>
-              <w:t>Ex.: SSP</w:t>
+              <w:t>Informar BR ou UF.</w:t>
             </w:r>
           </w:p>
         </w:tc>
@@ -1180,6 +1145,13 @@
               </w:rPr>
               <w:t>cliente_telefone_tipo</w:t>
             </w:r>
+            <w:r>
+              <w:rPr>
+                <w:sz w:val="20"/>
+                <w:szCs w:val="20"/>
+              </w:rPr>
+              <w:t>_1</w:t>
+            </w:r>
           </w:p>
         </w:tc>
         <w:tc>
@@ -1310,6 +1282,13 @@
               </w:rPr>
               <w:t>cliente_telefone_numero</w:t>
             </w:r>
+            <w:r>
+              <w:rPr>
+                <w:sz w:val="20"/>
+                <w:szCs w:val="20"/>
+              </w:rPr>
+              <w:t>_1</w:t>
+            </w:r>
           </w:p>
         </w:tc>
         <w:tc>
@@ -1337,6 +1316,485 @@
                 <w:szCs w:val="20"/>
               </w:rPr>
               <w:t>Obrigatório. Informar utilizando o padrão a seguir:</w:t>
+              <w:br/>
+              <w:t>Celular: 5573999341121</w:t>
+            </w:r>
+          </w:p>
+          <w:p>
+            <w:pPr>
+              <w:pStyle w:val="Normal"/>
+              <w:bidi w:val="0"/>
+              <w:jc w:val="start"/>
+              <w:rPr>
+                <w:sz w:val="20"/>
+                <w:szCs w:val="20"/>
+              </w:rPr>
+            </w:pPr>
+            <w:r>
+              <w:rPr>
+                <w:sz w:val="20"/>
+                <w:szCs w:val="20"/>
+              </w:rPr>
+              <w:t>Telefone fixo: 557330130001</w:t>
+            </w:r>
+          </w:p>
+        </w:tc>
+      </w:tr>
+      <w:tr>
+        <w:trPr/>
+        <w:tc>
+          <w:tcPr>
+            <w:tcW w:w="5100" w:type="dxa"/>
+            <w:tcBorders>
+              <w:start w:val="single" w:sz="4" w:space="0" w:color="000000"/>
+              <w:bottom w:val="single" w:sz="4" w:space="0" w:color="000000"/>
+            </w:tcBorders>
+          </w:tcPr>
+          <w:p>
+            <w:pPr>
+              <w:pStyle w:val="Normal"/>
+              <w:bidi w:val="0"/>
+              <w:jc w:val="start"/>
+              <w:rPr>
+                <w:sz w:val="20"/>
+                <w:szCs w:val="20"/>
+              </w:rPr>
+            </w:pPr>
+            <w:r>
+              <w:rPr>
+                <w:sz w:val="20"/>
+                <w:szCs w:val="20"/>
+              </w:rPr>
+              <w:t>cliente_telefone_tipo</w:t>
+            </w:r>
+            <w:r>
+              <w:rPr>
+                <w:sz w:val="20"/>
+                <w:szCs w:val="20"/>
+              </w:rPr>
+              <w:t>_2</w:t>
+            </w:r>
+          </w:p>
+        </w:tc>
+        <w:tc>
+          <w:tcPr>
+            <w:tcW w:w="4474" w:type="dxa"/>
+            <w:tcBorders>
+              <w:start w:val="single" w:sz="4" w:space="0" w:color="000000"/>
+              <w:bottom w:val="single" w:sz="4" w:space="0" w:color="000000"/>
+              <w:end w:val="single" w:sz="4" w:space="0" w:color="000000"/>
+            </w:tcBorders>
+          </w:tcPr>
+          <w:p>
+            <w:pPr>
+              <w:pStyle w:val="Normal"/>
+              <w:bidi w:val="0"/>
+              <w:jc w:val="start"/>
+              <w:rPr>
+                <w:sz w:val="20"/>
+                <w:szCs w:val="20"/>
+              </w:rPr>
+            </w:pPr>
+            <w:r>
+              <w:rPr>
+                <w:sz w:val="20"/>
+                <w:szCs w:val="20"/>
+              </w:rPr>
+              <w:t xml:space="preserve"> </w:t>
+            </w:r>
+            <w:r>
+              <w:rPr>
+                <w:sz w:val="20"/>
+                <w:szCs w:val="20"/>
+              </w:rPr>
+              <w:t xml:space="preserve">Opicional. </w:t>
+            </w:r>
+            <w:r>
+              <w:rPr>
+                <w:sz w:val="20"/>
+                <w:szCs w:val="20"/>
+              </w:rPr>
+              <w:t>Informe o tipo de telefone para contato com o cliente:</w:t>
+            </w:r>
+          </w:p>
+          <w:p>
+            <w:pPr>
+              <w:pStyle w:val="Normal"/>
+              <w:bidi w:val="0"/>
+              <w:jc w:val="start"/>
+              <w:rPr>
+                <w:sz w:val="20"/>
+                <w:szCs w:val="20"/>
+              </w:rPr>
+            </w:pPr>
+            <w:r>
+              <w:rPr>
+                <w:sz w:val="20"/>
+                <w:szCs w:val="20"/>
+              </w:rPr>
+              <w:t>- CELULAR</w:t>
+            </w:r>
+          </w:p>
+          <w:p>
+            <w:pPr>
+              <w:pStyle w:val="Normal"/>
+              <w:bidi w:val="0"/>
+              <w:jc w:val="start"/>
+              <w:rPr>
+                <w:sz w:val="20"/>
+                <w:szCs w:val="20"/>
+              </w:rPr>
+            </w:pPr>
+            <w:r>
+              <w:rPr>
+                <w:sz w:val="20"/>
+                <w:szCs w:val="20"/>
+              </w:rPr>
+              <w:t>- FIXO</w:t>
+            </w:r>
+          </w:p>
+          <w:p>
+            <w:pPr>
+              <w:pStyle w:val="Normal"/>
+              <w:bidi w:val="0"/>
+              <w:jc w:val="start"/>
+              <w:rPr>
+                <w:sz w:val="20"/>
+                <w:szCs w:val="20"/>
+              </w:rPr>
+            </w:pPr>
+            <w:r>
+              <w:rPr>
+                <w:sz w:val="20"/>
+                <w:szCs w:val="20"/>
+              </w:rPr>
+              <w:t>- COMERCIAL</w:t>
+            </w:r>
+          </w:p>
+          <w:p>
+            <w:pPr>
+              <w:pStyle w:val="Normal"/>
+              <w:bidi w:val="0"/>
+              <w:jc w:val="start"/>
+              <w:rPr>
+                <w:sz w:val="20"/>
+                <w:szCs w:val="20"/>
+              </w:rPr>
+            </w:pPr>
+            <w:r>
+              <w:rPr>
+                <w:sz w:val="20"/>
+                <w:szCs w:val="20"/>
+              </w:rPr>
+              <w:t>-RESIDENCIAL</w:t>
+            </w:r>
+          </w:p>
+        </w:tc>
+      </w:tr>
+      <w:tr>
+        <w:trPr/>
+        <w:tc>
+          <w:tcPr>
+            <w:tcW w:w="5100" w:type="dxa"/>
+            <w:tcBorders>
+              <w:start w:val="single" w:sz="4" w:space="0" w:color="000000"/>
+              <w:bottom w:val="single" w:sz="4" w:space="0" w:color="000000"/>
+            </w:tcBorders>
+          </w:tcPr>
+          <w:p>
+            <w:pPr>
+              <w:pStyle w:val="Normal"/>
+              <w:bidi w:val="0"/>
+              <w:jc w:val="start"/>
+              <w:rPr>
+                <w:sz w:val="20"/>
+                <w:szCs w:val="20"/>
+              </w:rPr>
+            </w:pPr>
+            <w:r>
+              <w:rPr>
+                <w:sz w:val="20"/>
+                <w:szCs w:val="20"/>
+              </w:rPr>
+              <w:t>cliente_telefone_numero</w:t>
+            </w:r>
+            <w:r>
+              <w:rPr>
+                <w:sz w:val="20"/>
+                <w:szCs w:val="20"/>
+              </w:rPr>
+              <w:t>_2</w:t>
+            </w:r>
+          </w:p>
+        </w:tc>
+        <w:tc>
+          <w:tcPr>
+            <w:tcW w:w="4474" w:type="dxa"/>
+            <w:tcBorders>
+              <w:start w:val="single" w:sz="4" w:space="0" w:color="000000"/>
+              <w:bottom w:val="single" w:sz="4" w:space="0" w:color="000000"/>
+              <w:end w:val="single" w:sz="4" w:space="0" w:color="000000"/>
+            </w:tcBorders>
+          </w:tcPr>
+          <w:p>
+            <w:pPr>
+              <w:pStyle w:val="Normal"/>
+              <w:bidi w:val="0"/>
+              <w:jc w:val="start"/>
+              <w:rPr>
+                <w:sz w:val="20"/>
+                <w:szCs w:val="20"/>
+              </w:rPr>
+            </w:pPr>
+            <w:r>
+              <w:rPr>
+                <w:sz w:val="20"/>
+                <w:szCs w:val="20"/>
+              </w:rPr>
+              <w:t xml:space="preserve">Opicional.  </w:t>
+            </w:r>
+            <w:r>
+              <w:rPr>
+                <w:sz w:val="20"/>
+                <w:szCs w:val="20"/>
+              </w:rPr>
+              <w:t>Informar utilizando o padrão a seguir:</w:t>
+              <w:br/>
+              <w:t>Celular: 5573999341121</w:t>
+            </w:r>
+          </w:p>
+          <w:p>
+            <w:pPr>
+              <w:pStyle w:val="Normal"/>
+              <w:bidi w:val="0"/>
+              <w:jc w:val="start"/>
+              <w:rPr>
+                <w:sz w:val="20"/>
+                <w:szCs w:val="20"/>
+              </w:rPr>
+            </w:pPr>
+            <w:r>
+              <w:rPr>
+                <w:sz w:val="20"/>
+                <w:szCs w:val="20"/>
+              </w:rPr>
+              <w:t>Telefone fixo: 557330130001</w:t>
+            </w:r>
+          </w:p>
+        </w:tc>
+      </w:tr>
+      <w:tr>
+        <w:trPr/>
+        <w:tc>
+          <w:tcPr>
+            <w:tcW w:w="5100" w:type="dxa"/>
+            <w:tcBorders>
+              <w:start w:val="single" w:sz="4" w:space="0" w:color="000000"/>
+              <w:bottom w:val="single" w:sz="4" w:space="0" w:color="000000"/>
+            </w:tcBorders>
+          </w:tcPr>
+          <w:p>
+            <w:pPr>
+              <w:pStyle w:val="Normal"/>
+              <w:bidi w:val="0"/>
+              <w:jc w:val="start"/>
+              <w:rPr>
+                <w:sz w:val="20"/>
+                <w:szCs w:val="20"/>
+              </w:rPr>
+            </w:pPr>
+            <w:r>
+              <w:rPr>
+                <w:sz w:val="20"/>
+                <w:szCs w:val="20"/>
+              </w:rPr>
+              <w:t>cliente_telefone_tipo</w:t>
+            </w:r>
+            <w:r>
+              <w:rPr>
+                <w:sz w:val="20"/>
+                <w:szCs w:val="20"/>
+              </w:rPr>
+              <w:t>_3</w:t>
+            </w:r>
+          </w:p>
+        </w:tc>
+        <w:tc>
+          <w:tcPr>
+            <w:tcW w:w="4474" w:type="dxa"/>
+            <w:tcBorders>
+              <w:start w:val="single" w:sz="4" w:space="0" w:color="000000"/>
+              <w:bottom w:val="single" w:sz="4" w:space="0" w:color="000000"/>
+              <w:end w:val="single" w:sz="4" w:space="0" w:color="000000"/>
+            </w:tcBorders>
+          </w:tcPr>
+          <w:p>
+            <w:pPr>
+              <w:pStyle w:val="Normal"/>
+              <w:bidi w:val="0"/>
+              <w:jc w:val="start"/>
+              <w:rPr>
+                <w:sz w:val="20"/>
+                <w:szCs w:val="20"/>
+              </w:rPr>
+            </w:pPr>
+            <w:r>
+              <w:rPr>
+                <w:sz w:val="20"/>
+                <w:szCs w:val="20"/>
+              </w:rPr>
+              <w:t xml:space="preserve">Opicional. </w:t>
+            </w:r>
+            <w:r>
+              <w:rPr>
+                <w:sz w:val="20"/>
+                <w:szCs w:val="20"/>
+              </w:rPr>
+              <w:t>Informe o tipo de telefone para contato com o cliente:</w:t>
+            </w:r>
+          </w:p>
+          <w:p>
+            <w:pPr>
+              <w:pStyle w:val="Normal"/>
+              <w:bidi w:val="0"/>
+              <w:jc w:val="start"/>
+              <w:rPr>
+                <w:sz w:val="20"/>
+                <w:szCs w:val="20"/>
+              </w:rPr>
+            </w:pPr>
+            <w:r>
+              <w:rPr>
+                <w:sz w:val="20"/>
+                <w:szCs w:val="20"/>
+              </w:rPr>
+              <w:t>- CELULAR</w:t>
+            </w:r>
+          </w:p>
+          <w:p>
+            <w:pPr>
+              <w:pStyle w:val="Normal"/>
+              <w:bidi w:val="0"/>
+              <w:jc w:val="start"/>
+              <w:rPr>
+                <w:sz w:val="20"/>
+                <w:szCs w:val="20"/>
+              </w:rPr>
+            </w:pPr>
+            <w:r>
+              <w:rPr>
+                <w:sz w:val="20"/>
+                <w:szCs w:val="20"/>
+              </w:rPr>
+              <w:t>- FIXO</w:t>
+            </w:r>
+          </w:p>
+          <w:p>
+            <w:pPr>
+              <w:pStyle w:val="Normal"/>
+              <w:bidi w:val="0"/>
+              <w:jc w:val="start"/>
+              <w:rPr>
+                <w:sz w:val="20"/>
+                <w:szCs w:val="20"/>
+              </w:rPr>
+            </w:pPr>
+            <w:r>
+              <w:rPr>
+                <w:sz w:val="20"/>
+                <w:szCs w:val="20"/>
+              </w:rPr>
+              <w:t>- COMERCIAL</w:t>
+            </w:r>
+          </w:p>
+          <w:p>
+            <w:pPr>
+              <w:pStyle w:val="Normal"/>
+              <w:bidi w:val="0"/>
+              <w:jc w:val="start"/>
+              <w:rPr>
+                <w:sz w:val="20"/>
+                <w:szCs w:val="20"/>
+              </w:rPr>
+            </w:pPr>
+            <w:r>
+              <w:rPr>
+                <w:sz w:val="20"/>
+                <w:szCs w:val="20"/>
+              </w:rPr>
+              <w:t>-RESIDENCIAL</w:t>
+            </w:r>
+          </w:p>
+        </w:tc>
+      </w:tr>
+      <w:tr>
+        <w:trPr/>
+        <w:tc>
+          <w:tcPr>
+            <w:tcW w:w="5100" w:type="dxa"/>
+            <w:tcBorders>
+              <w:start w:val="single" w:sz="4" w:space="0" w:color="000000"/>
+              <w:bottom w:val="single" w:sz="4" w:space="0" w:color="000000"/>
+            </w:tcBorders>
+          </w:tcPr>
+          <w:p>
+            <w:pPr>
+              <w:pStyle w:val="Normal"/>
+              <w:bidi w:val="0"/>
+              <w:jc w:val="start"/>
+              <w:rPr>
+                <w:sz w:val="20"/>
+                <w:szCs w:val="20"/>
+              </w:rPr>
+            </w:pPr>
+            <w:r>
+              <w:rPr>
+                <w:sz w:val="20"/>
+                <w:szCs w:val="20"/>
+              </w:rPr>
+              <w:t>cliente_telefone_numero</w:t>
+            </w:r>
+            <w:r>
+              <w:rPr>
+                <w:sz w:val="20"/>
+                <w:szCs w:val="20"/>
+              </w:rPr>
+              <w:t>_3</w:t>
+            </w:r>
+          </w:p>
+        </w:tc>
+        <w:tc>
+          <w:tcPr>
+            <w:tcW w:w="4474" w:type="dxa"/>
+            <w:tcBorders>
+              <w:start w:val="single" w:sz="4" w:space="0" w:color="000000"/>
+              <w:bottom w:val="single" w:sz="4" w:space="0" w:color="000000"/>
+              <w:end w:val="single" w:sz="4" w:space="0" w:color="000000"/>
+            </w:tcBorders>
+          </w:tcPr>
+          <w:p>
+            <w:pPr>
+              <w:pStyle w:val="Normal"/>
+              <w:bidi w:val="0"/>
+              <w:jc w:val="start"/>
+              <w:rPr>
+                <w:sz w:val="20"/>
+                <w:szCs w:val="20"/>
+              </w:rPr>
+            </w:pPr>
+            <w:r>
+              <w:rPr>
+                <w:sz w:val="20"/>
+                <w:szCs w:val="20"/>
+              </w:rPr>
+              <w:t xml:space="preserve">Opicional.  </w:t>
+            </w:r>
+            <w:r>
+              <w:rPr>
+                <w:sz w:val="20"/>
+                <w:szCs w:val="20"/>
+              </w:rPr>
+              <w:t>Informar utilizando o padrão a seguir:</w:t>
               <w:br/>
               <w:t>Celular: 5573999341121</w:t>
             </w:r>
@@ -2419,14 +2877,7 @@
                 <w:sz w:val="20"/>
                 <w:szCs w:val="20"/>
               </w:rPr>
-              <w:t xml:space="preserve">- </w:t>
-            </w:r>
-            <w:r>
-              <w:rPr>
-                <w:sz w:val="20"/>
-                <w:szCs w:val="20"/>
-              </w:rPr>
-              <w:t>PASSAPORTE</w:t>
+              <w:t>- PASSAPORTE</w:t>
             </w:r>
           </w:p>
           <w:p>
@@ -4174,14 +4625,7 @@
                 <w:sz w:val="20"/>
                 <w:szCs w:val="20"/>
               </w:rPr>
-              <w:t xml:space="preserve">- </w:t>
-            </w:r>
-            <w:r>
-              <w:rPr>
-                <w:sz w:val="20"/>
-                <w:szCs w:val="20"/>
-              </w:rPr>
-              <w:t>PASSAPORTE</w:t>
+              <w:t>- PASSAPORTE</w:t>
             </w:r>
           </w:p>
           <w:p>
@@ -4615,7 +5059,7 @@
     <w:pPr>
       <w:widowControl/>
       <w:suppressAutoHyphens w:val="true"/>
-      <w:overflowPunct w:val="false"/>
+      <w:overflowPunct w:val="true"/>
       <w:bidi w:val="0"/>
       <w:spacing w:before="0" w:after="0"/>
       <w:jc w:val="start"/>
@@ -4685,7 +5129,6 @@
     </w:pPr>
     <w:rPr>
       <w:rFonts w:cs="Arial"/>
-      <w:lang w:val="zxx" w:eastAsia="zxx" w:bidi="zxx"/>
     </w:rPr>
   </w:style>
   <w:style w:type="paragraph" w:styleId="Ttulouser">
@@ -4712,6 +5155,30 @@
     </w:pPr>
     <w:rPr>
       <w:rFonts w:cs="Arial"/>
+      <w:lang w:val="zxx" w:eastAsia="zxx" w:bidi="zxx"/>
+    </w:rPr>
+  </w:style>
+  <w:style w:type="paragraph" w:styleId="Contedodatabelauser">
+    <w:name w:val="Conteúdo da tabela (user)"/>
+    <w:basedOn w:val="Normal"/>
+    <w:qFormat/>
+    <w:pPr>
+      <w:widowControl w:val="false"/>
+      <w:suppressLineNumbers/>
+    </w:pPr>
+    <w:rPr/>
+  </w:style>
+  <w:style w:type="paragraph" w:styleId="Ttulodetabelauser">
+    <w:name w:val="Título de tabela (user)"/>
+    <w:basedOn w:val="Contedodatabelauser"/>
+    <w:qFormat/>
+    <w:pPr>
+      <w:suppressLineNumbers/>
+      <w:jc w:val="center"/>
+    </w:pPr>
+    <w:rPr>
+      <w:b/>
+      <w:bCs/>
     </w:rPr>
   </w:style>
   <w:style w:type="paragraph" w:styleId="Contedodatabela">
@@ -4727,29 +5194,6 @@
   <w:style w:type="paragraph" w:styleId="Ttulodetabela">
     <w:name w:val="Título de tabela"/>
     <w:basedOn w:val="Contedodatabela"/>
-    <w:qFormat/>
-    <w:pPr>
-      <w:suppressLineNumbers/>
-      <w:jc w:val="center"/>
-    </w:pPr>
-    <w:rPr>
-      <w:b/>
-      <w:bCs/>
-    </w:rPr>
-  </w:style>
-  <w:style w:type="paragraph" w:styleId="Contedodatabelauser">
-    <w:name w:val="Conteúdo da tabela (user)"/>
-    <w:basedOn w:val="Normal"/>
-    <w:qFormat/>
-    <w:pPr>
-      <w:widowControl w:val="false"/>
-      <w:suppressLineNumbers/>
-    </w:pPr>
-    <w:rPr/>
-  </w:style>
-  <w:style w:type="paragraph" w:styleId="Ttulodetabelauser">
-    <w:name w:val="Título de tabela (user)"/>
-    <w:basedOn w:val="Contedodatabelauser"/>
     <w:qFormat/>
     <w:pPr>
       <w:suppressLineNumbers/>

</xml_diff>